<commit_message>
Add screenshot and repository link
</commit_message>
<xml_diff>
--- a/module-1/MarcoRodriguezGomez-Assignment1_2.docx
+++ b/module-1/MarcoRodriguezGomez-Assignment1_2.docx
@@ -29,6 +29,50 @@
     <w:p/>
     <w:p>
       <w:r>
+        <w:t>https://github.com/mrodriguezLearning/csd-325</w:t>
+      </w:r>
+    </w:p>
+    <w:p>
+      <w:r>
+        <w:drawing>
+          <wp:inline distT="0" distB="0" distL="0" distR="0" wp14:anchorId="4815FD28" wp14:editId="04732957">
+            <wp:extent cx="5943600" cy="3754755"/>
+            <wp:effectExtent l="0" t="0" r="0" b="0"/>
+            <wp:docPr id="1029840695" name="Picture 1"/>
+            <wp:cNvGraphicFramePr>
+              <a:graphicFrameLocks xmlns:a="http://schemas.openxmlformats.org/drawingml/2006/main" noChangeAspect="1"/>
+            </wp:cNvGraphicFramePr>
+            <a:graphic xmlns:a="http://schemas.openxmlformats.org/drawingml/2006/main">
+              <a:graphicData uri="http://schemas.openxmlformats.org/drawingml/2006/picture">
+                <pic:pic xmlns:pic="http://schemas.openxmlformats.org/drawingml/2006/picture">
+                  <pic:nvPicPr>
+                    <pic:cNvPr id="1029840695" name=""/>
+                    <pic:cNvPicPr/>
+                  </pic:nvPicPr>
+                  <pic:blipFill>
+                    <a:blip r:embed="rId4"/>
+                    <a:stretch>
+                      <a:fillRect/>
+                    </a:stretch>
+                  </pic:blipFill>
+                  <pic:spPr>
+                    <a:xfrm>
+                      <a:off x="0" y="0"/>
+                      <a:ext cx="5943600" cy="3754755"/>
+                    </a:xfrm>
+                    <a:prstGeom prst="rect">
+                      <a:avLst/>
+                    </a:prstGeom>
+                  </pic:spPr>
+                </pic:pic>
+              </a:graphicData>
+            </a:graphic>
+          </wp:inline>
+        </w:drawing>
+      </w:r>
+    </w:p>
+    <w:p>
+      <w:r>
         <w:drawing>
           <wp:inline distT="0" distB="0" distL="0" distR="0" wp14:anchorId="0B83B55E" wp14:editId="04ACFB3D">
             <wp:extent cx="5943600" cy="2474595"/>
@@ -45,7 +89,7 @@
                     <pic:cNvPicPr/>
                   </pic:nvPicPr>
                   <pic:blipFill>
-                    <a:blip r:embed="rId4"/>
+                    <a:blip r:embed="rId5"/>
                     <a:stretch>
                       <a:fillRect/>
                     </a:stretch>

</xml_diff>